<commit_message>
papp group url change
</commit_message>
<xml_diff>
--- a/docs/cv_en.docx
+++ b/docs/cv_en.docx
@@ -194,7 +194,7 @@
           <w:rPr>
             <w:rStyle w:val="Hyperlink"/>
           </w:rPr>
-          <w:t xml:space="preserve">Biological Research Centre, Szeged, H</w:t>
+          <w:t xml:space="preserve">HUN-REN Biological Research Centre, Szeged, H</w:t>
         </w:r>
       </w:hyperlink>
     </w:p>
@@ -2792,7 +2792,7 @@
           <w:b/>
           <w:bCs/>
         </w:rPr>
-        <w:t xml:space="preserve">941</w:t>
+        <w:t xml:space="preserve">942</w:t>
       </w:r>
     </w:p>
     <w:p>
@@ -3133,7 +3133,7 @@
           <w:b/>
           <w:bCs/>
         </w:rPr>
-        <w:t xml:space="preserve">D1, IF: 45.5, IC: 46</w:t>
+        <w:t xml:space="preserve">D1, IF: 45.5, IC: 47</w:t>
       </w:r>
     </w:p>
     <w:p>

</xml_diff>